<commit_message>
docs: include dynamic storage vs alphabetical methodology analysis for presentation
</commit_message>
<xml_diff>
--- a/docs/MANUAL_DE_IMPLEMENTACION_Y_OPERACION.docx
+++ b/docs/MANUAL_DE_IMPLEMENTACION_Y_OPERACION.docx
@@ -442,8 +442,571 @@
     </w:tbl>
     <w:p>
       <w:pPr>
+        <w:pStyle w:val="BodyText"/>
+        <w:bidi w:val="0"/>
+        <w:spacing w:before="0" w:after="60"/>
+        <w:ind w:hanging="0" w:left="270" w:right="270"/>
+        <w:rPr>
+          <w:b/>
+          <w:caps/>
+          <w:color w:val="13322B"/>
+          <w:spacing w:val="0"/>
+          <w:sz w:val="20"/>
+          <w:bdr w:val="single" w:sz="24" w:space="14" w:color="2B6CB0"/>
+          <w:shd w:fill="F0F7FF" w:val="clear"/>
+        </w:rPr>
+      </w:pPr>
+      <w:r>
+        <w:rPr>
+          <w:b/>
+          <w:caps/>
+          <w:color w:val="13322B"/>
+          <w:spacing w:val="0"/>
+          <w:sz w:val="20"/>
+          <w:bdr w:val="single" w:sz="24" w:space="14" w:color="2B6CB0"/>
+          <w:shd w:fill="F0F7FF" w:val="clear"/>
+        </w:rPr>
+        <w:t>Nota Importante a Analizar para Exposición: ¿Clasificación Alfabética Estricta vs. Asignación Pura por Cajón?</w:t>
+      </w:r>
+    </w:p>
+    <w:p>
+      <w:pPr>
+        <w:pStyle w:val="BodyText"/>
+        <w:bidi w:val="0"/>
+        <w:spacing w:before="0" w:after="120"/>
+        <w:ind w:hanging="0" w:left="270" w:right="270"/>
+        <w:rPr/>
+      </w:pPr>
+      <w:r>
+        <w:rPr>
+          <w:bdr w:val="single" w:sz="24" w:space="14" w:color="2B6CB0"/>
+          <w:shd w:fill="F0F7FF" w:val="clear"/>
+        </w:rPr>
+        <w:t xml:space="preserve">Durante el diseño e implementación del sistema surge una decisión operativa crucial para el área: </w:t>
+      </w:r>
+      <w:r>
+        <w:rPr>
+          <w:rStyle w:val="Strong"/>
+          <w:bdr w:val="single" w:sz="24" w:space="14" w:color="2B6CB0"/>
+          <w:shd w:fill="F0F7FF" w:val="clear"/>
+        </w:rPr>
+        <w:t>¿Debemos obligar a que cada cajón mantenga un rango de letras estricto (ej. A-C, D-F) o es viable prescindir de las letras y asignar los expedientes únicamente por Gaveta y Cajón conforme haya espacio físico disponible?</w:t>
+      </w:r>
+      <w:r>
+        <w:rPr>
+          <w:bdr w:val="single" w:sz="24" w:space="14" w:color="2B6CB0"/>
+          <w:shd w:fill="F0F7FF" w:val="clear"/>
+        </w:rPr>
+        <w:t xml:space="preserve"> </w:t>
+      </w:r>
+    </w:p>
+    <w:p>
+      <w:pPr>
+        <w:pStyle w:val="BodyText"/>
+        <w:bidi w:val="0"/>
+        <w:spacing w:before="0" w:after="120"/>
+        <w:ind w:hanging="0" w:left="270" w:right="270"/>
+        <w:rPr/>
+      </w:pPr>
+      <w:r>
+        <w:rPr>
+          <w:bdr w:val="single" w:sz="24" w:space="14" w:color="2B6CB0"/>
+          <w:shd w:fill="F0F7FF" w:val="clear"/>
+        </w:rPr>
+        <w:t xml:space="preserve">Esta segunda alternativa es conocida en la logística documental moderna como </w:t>
+      </w:r>
+      <w:r>
+        <w:rPr>
+          <w:rStyle w:val="Strong"/>
+          <w:bdr w:val="single" w:sz="24" w:space="14" w:color="2B6CB0"/>
+          <w:shd w:fill="F0F7FF" w:val="clear"/>
+        </w:rPr>
+        <w:t>"Almacenamiento Dinámico / Caos Organizado"</w:t>
+      </w:r>
+      <w:r>
+        <w:rPr>
+          <w:bdr w:val="single" w:sz="24" w:space="14" w:color="2B6CB0"/>
+          <w:shd w:fill="F0F7FF" w:val="clear"/>
+        </w:rPr>
+        <w:t xml:space="preserve"> (modelo utilizado por centros de distribución de alta densidad y archivos generales). A continuación se expone la comparativa para el análisis institucional: </w:t>
+      </w:r>
+    </w:p>
+    <w:tbl>
+      <w:tblPr>
+        <w:tblW w:w="10799" w:type="dxa"/>
+        <w:jc w:val="left"/>
+        <w:tblInd w:w="298" w:type="dxa"/>
+        <w:shd w:fill="FFFFFF" w:val="clear"/>
+        <w:tblLayout w:type="fixed"/>
+        <w:tblCellMar>
+          <w:top w:w="28" w:type="dxa"/>
+          <w:left w:w="28" w:type="dxa"/>
+          <w:bottom w:w="28" w:type="dxa"/>
+          <w:right w:w="28" w:type="dxa"/>
+        </w:tblCellMar>
+      </w:tblPr>
+      <w:tblGrid>
+        <w:gridCol w:w="2252"/>
+        <w:gridCol w:w="4348"/>
+        <w:gridCol w:w="4199"/>
+      </w:tblGrid>
+      <w:tr>
+        <w:trPr>
+          <w:tblHeader w:val="true"/>
+        </w:trPr>
+        <w:tc>
+          <w:tcPr>
+            <w:tcW w:w="2252" w:type="dxa"/>
+            <w:tcBorders/>
+            <w:shd w:fill="FFFFFF" w:val="clear"/>
+            <w:vAlign w:val="center"/>
+          </w:tcPr>
+          <w:p>
+            <w:pPr>
+              <w:pStyle w:val="TableHeading"/>
+              <w:bidi w:val="0"/>
+              <w:spacing w:before="0" w:after="120"/>
+              <w:ind w:hanging="0" w:left="0" w:right="0"/>
+              <w:rPr/>
+            </w:pPr>
+            <w:r>
+              <w:rPr/>
+              <w:t>Dimensión</w:t>
+            </w:r>
+          </w:p>
+        </w:tc>
+        <w:tc>
+          <w:tcPr>
+            <w:tcW w:w="4348" w:type="dxa"/>
+            <w:tcBorders/>
+            <w:shd w:fill="FFFFFF" w:val="clear"/>
+            <w:vAlign w:val="center"/>
+          </w:tcPr>
+          <w:p>
+            <w:pPr>
+              <w:pStyle w:val="TableHeading"/>
+              <w:bidi w:val="0"/>
+              <w:spacing w:before="0" w:after="120"/>
+              <w:ind w:hanging="0" w:left="0" w:right="0"/>
+              <w:rPr/>
+            </w:pPr>
+            <w:r>
+              <w:rPr/>
+              <w:t>Modelo Tradicional por Letras (A - Z)</w:t>
+            </w:r>
+          </w:p>
+        </w:tc>
+        <w:tc>
+          <w:tcPr>
+            <w:tcW w:w="4199" w:type="dxa"/>
+            <w:tcBorders/>
+            <w:shd w:fill="FFFFFF" w:val="clear"/>
+            <w:vAlign w:val="center"/>
+          </w:tcPr>
+          <w:p>
+            <w:pPr>
+              <w:pStyle w:val="TableHeading"/>
+              <w:suppressLineNumbers/>
+              <w:bidi w:val="0"/>
+              <w:spacing w:before="0" w:after="120"/>
+              <w:jc w:val="center"/>
+              <w:rPr/>
+            </w:pPr>
+            <w:r>
+              <w:rPr/>
+              <w:t>Modelo Dinámico por Cajón (Sin Letras)</w:t>
+            </w:r>
+          </w:p>
+        </w:tc>
+      </w:tr>
+      <w:tr>
+        <w:trPr/>
+        <w:tc>
+          <w:tcPr>
+            <w:tcW w:w="2252" w:type="dxa"/>
+            <w:tcBorders/>
+            <w:shd w:fill="FFFFFF" w:val="clear"/>
+            <w:vAlign w:val="center"/>
+          </w:tcPr>
+          <w:p>
+            <w:pPr>
+              <w:pStyle w:val="TableContents"/>
+              <w:bidi w:val="0"/>
+              <w:spacing w:before="0" w:after="120"/>
+              <w:rPr/>
+            </w:pPr>
+            <w:r>
+              <w:rPr>
+                <w:rStyle w:val="Strong"/>
+              </w:rPr>
+              <w:t>Aprovechamiento del Espacio</w:t>
+            </w:r>
+          </w:p>
+        </w:tc>
+        <w:tc>
+          <w:tcPr>
+            <w:tcW w:w="4348" w:type="dxa"/>
+            <w:tcBorders/>
+            <w:shd w:fill="FFFFFF" w:val="clear"/>
+            <w:vAlign w:val="center"/>
+          </w:tcPr>
+          <w:p>
+            <w:pPr>
+              <w:pStyle w:val="TableContents"/>
+              <w:bidi w:val="0"/>
+              <w:spacing w:before="0" w:after="120"/>
+              <w:rPr/>
+            </w:pPr>
+            <w:r>
+              <w:rPr>
+                <w:rStyle w:val="Strong"/>
+              </w:rPr>
+              <w:t>Deficiente.</w:t>
+            </w:r>
+            <w:r>
+              <w:rPr/>
+              <w:t xml:space="preserve"> Los cajones de letras de alta frecuencia (G, M, R) se desbordan constantemente, mientras que cajones de letras poco comunes (K, U, W, X, Z) permanecen semivacíos.</w:t>
+            </w:r>
+          </w:p>
+        </w:tc>
+        <w:tc>
+          <w:tcPr>
+            <w:tcW w:w="4199" w:type="dxa"/>
+            <w:tcBorders/>
+            <w:shd w:fill="FFFFFF" w:val="clear"/>
+            <w:vAlign w:val="center"/>
+          </w:tcPr>
+          <w:p>
+            <w:pPr>
+              <w:pStyle w:val="TableContents"/>
+              <w:bidi w:val="0"/>
+              <w:spacing w:before="0" w:after="120"/>
+              <w:rPr/>
+            </w:pPr>
+            <w:r>
+              <w:rPr>
+                <w:rStyle w:val="Strong"/>
+              </w:rPr>
+              <w:t>Óptimo (100%).</w:t>
+            </w:r>
+            <w:r>
+              <w:rPr/>
+              <w:t xml:space="preserve"> Cada cajón se llena al tope de su capacidad física sin importar el apellido. No existen huecos ociosos en los archiveros.</w:t>
+            </w:r>
+          </w:p>
+        </w:tc>
+      </w:tr>
+      <w:tr>
+        <w:trPr/>
+        <w:tc>
+          <w:tcPr>
+            <w:tcW w:w="2252" w:type="dxa"/>
+            <w:tcBorders/>
+            <w:shd w:fill="FFFFFF" w:val="clear"/>
+            <w:vAlign w:val="center"/>
+          </w:tcPr>
+          <w:p>
+            <w:pPr>
+              <w:pStyle w:val="TableContents"/>
+              <w:bidi w:val="0"/>
+              <w:spacing w:before="0" w:after="120"/>
+              <w:rPr/>
+            </w:pPr>
+            <w:r>
+              <w:rPr>
+                <w:rStyle w:val="Strong"/>
+              </w:rPr>
+              <w:t>Ingreso de Nuevos Expedientes</w:t>
+            </w:r>
+          </w:p>
+        </w:tc>
+        <w:tc>
+          <w:tcPr>
+            <w:tcW w:w="4348" w:type="dxa"/>
+            <w:tcBorders/>
+            <w:shd w:fill="FFFFFF" w:val="clear"/>
+            <w:vAlign w:val="center"/>
+          </w:tcPr>
+          <w:p>
+            <w:pPr>
+              <w:pStyle w:val="TableContents"/>
+              <w:bidi w:val="0"/>
+              <w:spacing w:before="0" w:after="120"/>
+              <w:rPr/>
+            </w:pPr>
+            <w:r>
+              <w:rPr>
+                <w:rStyle w:val="Strong"/>
+              </w:rPr>
+              <w:t>Complejo y tardado.</w:t>
+            </w:r>
+            <w:r>
+              <w:rPr/>
+              <w:t xml:space="preserve"> Para insertar un expediente nuevo en un cajón lleno, el personal debe recorrer manualmente decenas de carpetas hacia cajones contiguos.</w:t>
+            </w:r>
+          </w:p>
+        </w:tc>
+        <w:tc>
+          <w:tcPr>
+            <w:tcW w:w="4199" w:type="dxa"/>
+            <w:tcBorders/>
+            <w:shd w:fill="FFFFFF" w:val="clear"/>
+            <w:vAlign w:val="center"/>
+          </w:tcPr>
+          <w:p>
+            <w:pPr>
+              <w:pStyle w:val="TableContents"/>
+              <w:bidi w:val="0"/>
+              <w:spacing w:before="0" w:after="120"/>
+              <w:rPr/>
+            </w:pPr>
+            <w:r>
+              <w:rPr>
+                <w:rStyle w:val="Strong"/>
+              </w:rPr>
+              <w:t>Inmediato.</w:t>
+            </w:r>
+            <w:r>
+              <w:rPr/>
+              <w:t xml:space="preserve"> El nuevo expediente se guarda en el primer cajón con espacio disponible. El sistema asocia la ubicación al instante y la búsqueda lo localiza en segundos.</w:t>
+            </w:r>
+          </w:p>
+        </w:tc>
+      </w:tr>
+      <w:tr>
+        <w:trPr/>
+        <w:tc>
+          <w:tcPr>
+            <w:tcW w:w="2252" w:type="dxa"/>
+            <w:tcBorders/>
+            <w:shd w:fill="FFFFFF" w:val="clear"/>
+            <w:vAlign w:val="center"/>
+          </w:tcPr>
+          <w:p>
+            <w:pPr>
+              <w:pStyle w:val="TableContents"/>
+              <w:bidi w:val="0"/>
+              <w:spacing w:before="0" w:after="120"/>
+              <w:rPr/>
+            </w:pPr>
+            <w:r>
+              <w:rPr>
+                <w:rStyle w:val="Strong"/>
+              </w:rPr>
+              <w:t>Dependencia Tecnológica</w:t>
+            </w:r>
+          </w:p>
+        </w:tc>
+        <w:tc>
+          <w:tcPr>
+            <w:tcW w:w="4348" w:type="dxa"/>
+            <w:tcBorders/>
+            <w:shd w:fill="FFFFFF" w:val="clear"/>
+            <w:vAlign w:val="center"/>
+          </w:tcPr>
+          <w:p>
+            <w:pPr>
+              <w:pStyle w:val="TableContents"/>
+              <w:bidi w:val="0"/>
+              <w:spacing w:before="0" w:after="120"/>
+              <w:rPr/>
+            </w:pPr>
+            <w:r>
+              <w:rPr>
+                <w:rStyle w:val="Strong"/>
+              </w:rPr>
+              <w:t>Baja.</w:t>
+            </w:r>
+            <w:r>
+              <w:rPr/>
+              <w:t xml:space="preserve"> Si la red o el equipo no están disponibles, el personal puede guiarse visualmente por el orden alfabético impreso en las carátulas.</w:t>
+            </w:r>
+          </w:p>
+        </w:tc>
+        <w:tc>
+          <w:tcPr>
+            <w:tcW w:w="4199" w:type="dxa"/>
+            <w:tcBorders/>
+            <w:shd w:fill="FFFFFF" w:val="clear"/>
+            <w:vAlign w:val="center"/>
+          </w:tcPr>
+          <w:p>
+            <w:pPr>
+              <w:pStyle w:val="TableContents"/>
+              <w:bidi w:val="0"/>
+              <w:spacing w:before="0" w:after="120"/>
+              <w:rPr/>
+            </w:pPr>
+            <w:r>
+              <w:rPr>
+                <w:rStyle w:val="Strong"/>
+              </w:rPr>
+              <w:t>Total (100%).</w:t>
+            </w:r>
+            <w:r>
+              <w:rPr/>
+              <w:t xml:space="preserve"> El personal depende obligatoriamente del sistema para saber en qué gaveta y cajón está el expediente, ya que físicamente no guardan secuencia alfabética.</w:t>
+            </w:r>
+          </w:p>
+        </w:tc>
+      </w:tr>
+      <w:tr>
+        <w:trPr/>
+        <w:tc>
+          <w:tcPr>
+            <w:tcW w:w="2252" w:type="dxa"/>
+            <w:tcBorders/>
+            <w:shd w:fill="FFFFFF" w:val="clear"/>
+            <w:vAlign w:val="center"/>
+          </w:tcPr>
+          <w:p>
+            <w:pPr>
+              <w:pStyle w:val="TableContents"/>
+              <w:bidi w:val="0"/>
+              <w:spacing w:before="0" w:after="120"/>
+              <w:rPr/>
+            </w:pPr>
+            <w:r>
+              <w:rPr>
+                <w:rStyle w:val="Strong"/>
+              </w:rPr>
+              <w:t>Compatibilidad con el Sistema</w:t>
+            </w:r>
+          </w:p>
+        </w:tc>
+        <w:tc>
+          <w:tcPr>
+            <w:tcW w:w="4348" w:type="dxa"/>
+            <w:tcBorders/>
+            <w:shd w:fill="FFFFFF" w:val="clear"/>
+            <w:vAlign w:val="center"/>
+          </w:tcPr>
+          <w:p>
+            <w:pPr>
+              <w:pStyle w:val="TableContents"/>
+              <w:bidi w:val="0"/>
+              <w:spacing w:before="0" w:after="120"/>
+              <w:rPr/>
+            </w:pPr>
+            <w:r>
+              <w:rPr>
+                <w:rStyle w:val="Strong"/>
+              </w:rPr>
+              <w:t>Soportada al 100%.</w:t>
+            </w:r>
+            <w:r>
+              <w:rPr/>
+              <w:t xml:space="preserve"> El sistema filtra automáticamente las colas por el rango alfabético del cajón (ej. </w:t>
+            </w:r>
+            <w:r>
+              <w:rPr>
+                <w:rStyle w:val="SourceText"/>
+              </w:rPr>
+              <w:t>A - C</w:t>
+            </w:r>
+            <w:r>
+              <w:rPr/>
+              <w:t>).</w:t>
+            </w:r>
+          </w:p>
+        </w:tc>
+        <w:tc>
+          <w:tcPr>
+            <w:tcW w:w="4199" w:type="dxa"/>
+            <w:tcBorders/>
+            <w:shd w:fill="FFFFFF" w:val="clear"/>
+            <w:vAlign w:val="center"/>
+          </w:tcPr>
+          <w:p>
+            <w:pPr>
+              <w:pStyle w:val="TableContents"/>
+              <w:bidi w:val="0"/>
+              <w:spacing w:before="0" w:after="120"/>
+              <w:rPr/>
+            </w:pPr>
+            <w:r>
+              <w:rPr>
+                <w:rStyle w:val="Strong"/>
+              </w:rPr>
+              <w:t>Soportada al 100%.</w:t>
+            </w:r>
+            <w:r>
+              <w:rPr/>
+              <w:t xml:space="preserve"> El catálogo de archiveros permite dejar el campo de rango alfabético en blanco y trabajar únicamente con número de Gaveta y Cajón.</w:t>
+            </w:r>
+          </w:p>
+        </w:tc>
+      </w:tr>
+    </w:tbl>
+    <w:p>
+      <w:pPr>
+        <w:pStyle w:val="BodyText"/>
+        <w:bidi w:val="0"/>
+        <w:spacing w:before="150" w:after="120"/>
+        <w:ind w:hanging="0" w:left="270" w:right="270"/>
+        <w:rPr/>
+      </w:pPr>
+      <w:r>
+        <w:rPr>
+          <w:rStyle w:val="Strong"/>
+          <w:caps/>
+          <w:color w:val="13322B"/>
+          <w:sz w:val="19"/>
+          <w:bdr w:val="single" w:sz="2" w:space="8" w:color="CBD5E0"/>
+          <w:shd w:fill="FFFFFF" w:val="clear"/>
+        </w:rPr>
+        <w:t>Propuesta Híbrida Recomendada para Exposición:</w:t>
+      </w:r>
+      <w:r>
+        <w:rPr>
+          <w:bdr w:val="single" w:sz="2" w:space="8" w:color="CBD5E0"/>
+          <w:shd w:fill="FFFFFF" w:val="clear"/>
+        </w:rPr>
+        <w:t xml:space="preserve"> </w:t>
+      </w:r>
+    </w:p>
+    <w:p>
+      <w:pPr>
+        <w:pStyle w:val="BodyText"/>
+        <w:bidi w:val="0"/>
+        <w:spacing w:before="60" w:after="60"/>
+        <w:ind w:hanging="0" w:left="330" w:right="330"/>
+        <w:rPr/>
+      </w:pPr>
+      <w:r>
+        <w:rPr>
+          <w:color w:val="4A5568"/>
+          <w:sz w:val="19"/>
+          <w:bdr w:val="single" w:sz="2" w:space="8" w:color="CBD5E0"/>
+          <w:shd w:fill="FFFFFF" w:val="clear"/>
+        </w:rPr>
+        <w:t xml:space="preserve">Para combinar la alta eficiencia de espacio con la tranquilidad operativa del personal, se recomienda la </w:t>
+      </w:r>
+      <w:r>
+        <w:rPr>
+          <w:rStyle w:val="Strong"/>
+          <w:color w:val="4A5568"/>
+          <w:sz w:val="19"/>
+          <w:bdr w:val="single" w:sz="2" w:space="8" w:color="CBD5E0"/>
+          <w:shd w:fill="FFFFFF" w:val="clear"/>
+        </w:rPr>
+        <w:t>"Clasificación Alfabética Flexible por Gaveta"</w:t>
+      </w:r>
+      <w:r>
+        <w:rPr>
+          <w:color w:val="4A5568"/>
+          <w:sz w:val="19"/>
+          <w:bdr w:val="single" w:sz="2" w:space="8" w:color="CBD5E0"/>
+          <w:shd w:fill="FFFFFF" w:val="clear"/>
+        </w:rPr>
+        <w:t xml:space="preserve">: cada Archivero/Gaveta completa ampara un bloque amplio de letras (ej. Gaveta 1: A–F, Gaveta 2: G–M, Gaveta 3: N–Z). Dentro de esa gaveta, el sistema asigna y guía con precisión milimétrica el cajón exacto (1, 2, 3 o 4) donde reside la carpeta, eliminando el reacomodo manual de expedientes. </w:t>
+      </w:r>
+    </w:p>
+    <w:p>
+      <w:pPr>
         <w:pStyle w:val="Heading1"/>
         <w:bidi w:val="0"/>
+        <w:ind w:hanging="0"/>
         <w:jc w:val="left"/>
         <w:rPr/>
       </w:pPr>
@@ -2751,18 +3314,18 @@
       <w:iCs/>
     </w:rPr>
   </w:style>
+  <w:style w:type="character" w:styleId="SourceText">
+    <w:name w:val="Source Text"/>
+    <w:qFormat/>
+    <w:rPr>
+      <w:rFonts w:ascii="Liberation Mono" w:hAnsi="Liberation Mono" w:eastAsia="Noto Sans Mono CJK SC" w:cs="Liberation Mono"/>
+    </w:rPr>
+  </w:style>
   <w:style w:type="character" w:styleId="Bullets">
     <w:name w:val="Bullets"/>
     <w:qFormat/>
     <w:rPr>
       <w:rFonts w:ascii="OpenSymbol" w:hAnsi="OpenSymbol" w:eastAsia="OpenSymbol" w:cs="OpenSymbol"/>
-    </w:rPr>
-  </w:style>
-  <w:style w:type="character" w:styleId="SourceText">
-    <w:name w:val="Source Text"/>
-    <w:qFormat/>
-    <w:rPr>
-      <w:rFonts w:ascii="Liberation Mono" w:hAnsi="Liberation Mono" w:eastAsia="Noto Sans Mono CJK SC" w:cs="Liberation Mono"/>
     </w:rPr>
   </w:style>
   <w:style w:type="character" w:styleId="NumberingSymbols">

</xml_diff>